<commit_message>
unc-date-science-notes: DATA740: Week08 notes correction
</commit_message>
<xml_diff>
--- a/notes/Spring_2026/DATA740/Week08/docx/DATA740_Week08_notes.docx
+++ b/notes/Spring_2026/DATA740/Week08/docx/DATA740_Week08_notes.docx
@@ -2734,15 +2734,7 @@
                 <w:bCs/>
                 <w:color w:val="A02B93" w:themeColor="accent5"/>
               </w:rPr>
-              <w:t>h</w:t>
-            </w:r>
-            <w:r>
-              <w:rPr>
-                <w:b/>
-                <w:bCs/>
-                <w:color w:val="A02B93" w:themeColor="accent5"/>
-              </w:rPr>
-              <w:t>arm</w:t>
+              <w:t>harm</w:t>
             </w:r>
             <w:r>
               <w:rPr>
@@ -2939,13 +2931,7 @@
               <w:rPr>
                 <w:color w:val="A02B93" w:themeColor="accent5"/>
               </w:rPr>
-              <w:t xml:space="preserve"> by </w:t>
-            </w:r>
-            <w:r>
-              <w:rPr>
-                <w:color w:val="A02B93" w:themeColor="accent5"/>
-              </w:rPr>
-              <w:t>filtering</w:t>
+              <w:t xml:space="preserve"> by filtering</w:t>
             </w:r>
             <w:r>
               <w:rPr>
@@ -3074,15 +3060,7 @@
                 <w:color w:val="A02B93" w:themeColor="accent5"/>
               </w:rPr>
               <w:lastRenderedPageBreak/>
-              <w:t>l</w:t>
-            </w:r>
-            <w:r>
-              <w:rPr>
-                <w:b/>
-                <w:bCs/>
-                <w:color w:val="A02B93" w:themeColor="accent5"/>
-              </w:rPr>
-              <w:t>imit</w:t>
+              <w:t>limit</w:t>
             </w:r>
             <w:r>
               <w:rPr>
@@ -3480,10 +3458,7 @@
               <w:t>explanation</w:t>
             </w:r>
             <w:r>
-              <w:t>,</w:t>
-            </w:r>
-            <w:r>
-              <w:t xml:space="preserve"> so </w:t>
+              <w:t xml:space="preserve">, so </w:t>
             </w:r>
             <w:r>
               <w:rPr>
@@ -3695,17 +3670,7 @@
                 <w:iCs/>
                 <w:color w:val="595959" w:themeColor="text1" w:themeTint="A6"/>
               </w:rPr>
-              <w:t>Harvard Business Review</w:t>
-            </w:r>
-            <w:r>
-              <w:rPr>
-                <w:b w:val="0"/>
-                <w:bCs w:val="0"/>
-                <w:i/>
-                <w:iCs/>
-                <w:color w:val="595959" w:themeColor="text1" w:themeTint="A6"/>
-              </w:rPr>
-              <w:t xml:space="preserve">       </w:t>
+              <w:t xml:space="preserve">Harvard Business Review       </w:t>
             </w:r>
             <w:r>
               <w:rPr>
@@ -3790,15 +3755,7 @@
                 <w:bCs w:val="0"/>
                 <w:color w:val="404040" w:themeColor="text1" w:themeTint="BF"/>
               </w:rPr>
-              <w:t> </w:t>
-            </w:r>
-            <w:r>
-              <w:rPr>
-                <w:b w:val="0"/>
-                <w:bCs w:val="0"/>
-                <w:color w:val="404040" w:themeColor="text1" w:themeTint="BF"/>
-              </w:rPr>
-              <w:t xml:space="preserve"> </w:t>
+              <w:t xml:space="preserve">  </w:t>
             </w:r>
           </w:p>
           <w:p>
@@ -3821,25 +3778,7 @@
                   <w:bCs w:val="0"/>
                   <w:color w:val="156082" w:themeColor="accent1"/>
                 </w:rPr>
-                <w:t>Marleen H</w:t>
-              </w:r>
-              <w:r>
-                <w:rPr>
-                  <w:rStyle w:val="Hyperlink"/>
-                  <w:b w:val="0"/>
-                  <w:bCs w:val="0"/>
-                  <w:color w:val="156082" w:themeColor="accent1"/>
-                </w:rPr>
-                <w:t>u</w:t>
-              </w:r>
-              <w:r>
-                <w:rPr>
-                  <w:rStyle w:val="Hyperlink"/>
-                  <w:b w:val="0"/>
-                  <w:bCs w:val="0"/>
-                  <w:color w:val="156082" w:themeColor="accent1"/>
-                </w:rPr>
-                <w:t>ysman</w:t>
+                <w:t>Marleen Huysman</w:t>
               </w:r>
             </w:hyperlink>
           </w:p>
@@ -3958,10 +3897,7 @@
               <w:cnfStyle w:val="000000000000" w:firstRow="0" w:lastRow="0" w:firstColumn="0" w:lastColumn="0" w:oddVBand="0" w:evenVBand="0" w:oddHBand="0" w:evenHBand="0" w:firstRowFirstColumn="0" w:firstRowLastColumn="0" w:lastRowFirstColumn="0" w:lastRowLastColumn="0"/>
             </w:pPr>
             <w:r>
-              <w:t>i</w:t>
-            </w:r>
-            <w:r>
-              <w:t xml:space="preserve">t may </w:t>
+              <w:t xml:space="preserve">it may </w:t>
             </w:r>
             <w:r>
               <w:rPr>
@@ -4273,10 +4209,7 @@
               <w:cnfStyle w:val="000000000000" w:firstRow="0" w:lastRow="0" w:firstColumn="0" w:lastColumn="0" w:oddVBand="0" w:evenVBand="0" w:oddHBand="0" w:evenHBand="0" w:firstRowFirstColumn="0" w:firstRowLastColumn="0" w:lastRowFirstColumn="0" w:lastRowLastColumn="0"/>
             </w:pPr>
             <w:r>
-              <w:t>o</w:t>
-            </w:r>
-            <w:r>
-              <w:t xml:space="preserve">nce </w:t>
+              <w:t xml:space="preserve">once </w:t>
             </w:r>
             <w:r>
               <w:rPr>
@@ -4333,14 +4266,7 @@
                 <w:b/>
                 <w:bCs/>
               </w:rPr>
-              <w:t>rul</w:t>
-            </w:r>
-            <w:r>
-              <w:rPr>
-                <w:b/>
-                <w:bCs/>
-              </w:rPr>
-              <w:t>e</w:t>
+              <w:t>rule</w:t>
             </w:r>
           </w:p>
           <w:p>
@@ -4463,14 +4389,7 @@
                 <w:b/>
                 <w:bCs/>
               </w:rPr>
-              <w:t>insight</w:t>
-            </w:r>
-            <w:r>
-              <w:rPr>
-                <w:b/>
-                <w:bCs/>
-              </w:rPr>
-              <w:t>s</w:t>
+              <w:t>insights</w:t>
             </w:r>
             <w:r>
               <w:t xml:space="preserve"> to </w:t>
@@ -4706,14 +4625,7 @@
                 <w:b/>
                 <w:bCs/>
               </w:rPr>
-              <w:t>c</w:t>
-            </w:r>
-            <w:r>
-              <w:rPr>
-                <w:b/>
-                <w:bCs/>
-              </w:rPr>
-              <w:t>onsistency</w:t>
+              <w:t>consistency</w:t>
             </w:r>
             <w:r>
               <w:t xml:space="preserve"> in decision-making</w:t>
@@ -4738,15 +4650,7 @@
                 <w:bCs/>
                 <w:color w:val="A02B93" w:themeColor="accent5"/>
               </w:rPr>
-              <w:t>r</w:t>
-            </w:r>
-            <w:r>
-              <w:rPr>
-                <w:b/>
-                <w:bCs/>
-                <w:color w:val="A02B93" w:themeColor="accent5"/>
-              </w:rPr>
-              <w:t>educed</w:t>
+              <w:t>reduced</w:t>
             </w:r>
             <w:r>
               <w:rPr>
@@ -4784,14 +4688,7 @@
                 <w:b/>
                 <w:bCs/>
               </w:rPr>
-              <w:t>n</w:t>
-            </w:r>
-            <w:r>
-              <w:rPr>
-                <w:b/>
-                <w:bCs/>
-              </w:rPr>
-              <w:t>arrower</w:t>
+              <w:t>narrower</w:t>
             </w:r>
             <w:r>
               <w:t xml:space="preserve"> candidate </w:t>
@@ -4823,15 +4720,7 @@
                 <w:bCs/>
                 <w:color w:val="A02B93" w:themeColor="accent5"/>
               </w:rPr>
-              <w:t>h</w:t>
-            </w:r>
-            <w:r>
-              <w:rPr>
-                <w:b/>
-                <w:bCs/>
-                <w:color w:val="A02B93" w:themeColor="accent5"/>
-              </w:rPr>
-              <w:t>uman</w:t>
+              <w:t>human</w:t>
             </w:r>
             <w:r>
               <w:rPr>
@@ -4881,14 +4770,7 @@
                 <w:bCs/>
               </w:rPr>
               <w:lastRenderedPageBreak/>
-              <w:t>l</w:t>
-            </w:r>
-            <w:r>
-              <w:rPr>
-                <w:b/>
-                <w:bCs/>
-              </w:rPr>
-              <w:t>ess</w:t>
+              <w:t>less</w:t>
             </w:r>
             <w:r>
               <w:t xml:space="preserve"> </w:t>
@@ -4995,15 +4877,7 @@
                 <w:bCs/>
                 <w:color w:val="A02B93" w:themeColor="accent5"/>
               </w:rPr>
-              <w:t>i</w:t>
-            </w:r>
-            <w:r>
-              <w:rPr>
-                <w:b/>
-                <w:bCs/>
-                <w:color w:val="A02B93" w:themeColor="accent5"/>
-              </w:rPr>
-              <w:t>s</w:t>
+              <w:t>is</w:t>
             </w:r>
             <w:r>
               <w:rPr>
@@ -5375,7 +5249,17 @@
                 <w:iCs/>
                 <w:color w:val="595959" w:themeColor="text1" w:themeTint="A6"/>
               </w:rPr>
-              <w:t xml:space="preserve">Harvard Business Review       </w:t>
+              <w:t xml:space="preserve">The Guardian  </w:t>
+            </w:r>
+            <w:r>
+              <w:rPr>
+                <w:b w:val="0"/>
+                <w:bCs w:val="0"/>
+                <w:i/>
+                <w:iCs/>
+                <w:color w:val="595959" w:themeColor="text1" w:themeTint="A6"/>
+              </w:rPr>
+              <w:t xml:space="preserve">       </w:t>
             </w:r>
             <w:r>
               <w:rPr>
@@ -5458,15 +5342,7 @@
                 <w:bCs w:val="0"/>
                 <w:color w:val="595959" w:themeColor="text1" w:themeTint="A6"/>
               </w:rPr>
-              <w:t>w</w:t>
-            </w:r>
-            <w:r>
-              <w:rPr>
-                <w:b w:val="0"/>
-                <w:bCs w:val="0"/>
-                <w:color w:val="595959" w:themeColor="text1" w:themeTint="A6"/>
-              </w:rPr>
-              <w:t>omen working in technology and financial services are at a higher risk of job loss due to AI and automation than men</w:t>
+              <w:t>women working in technology and financial services are at a higher risk of job loss due to AI and automation than men</w:t>
             </w:r>
           </w:p>
           <w:p>
@@ -5487,21 +5363,7 @@
                 <w:b w:val="0"/>
                 <w:bCs w:val="0"/>
               </w:rPr>
-              <w:t>‘</w:t>
-            </w:r>
-            <w:r>
-              <w:rPr>
-                <w:b w:val="0"/>
-                <w:bCs w:val="0"/>
-              </w:rPr>
-              <w:t>m</w:t>
-            </w:r>
-            <w:r>
-              <w:rPr>
-                <w:b w:val="0"/>
-                <w:bCs w:val="0"/>
-              </w:rPr>
-              <w:t>id-career’ female workers also being sidelined by rigid hiring processes</w:t>
+              <w:t>‘mid-career’ female workers also being sidelined by rigid hiring processes</w:t>
             </w:r>
           </w:p>
           <w:p>
@@ -8736,6 +8598,7 @@
   <w:style w:type="character" w:default="1" w:styleId="DefaultParagraphFont">
     <w:name w:val="Default Paragraph Font"/>
     <w:uiPriority w:val="1"/>
+    <w:semiHidden/>
     <w:unhideWhenUsed/>
   </w:style>
   <w:style w:type="table" w:default="1" w:styleId="TableNormal">

</xml_diff>